<commit_message>
Sync resume to latest FullStackGTMEngineer.docx (Jun 16)
Uses Downloads canonical DOCX/PDF as source of truth. Updates markdown,
job portals, and portfolio exports to match most recent full-stack resume.
</commit_message>
<xml_diff>
--- a/profile/rasul-shaikh-fullstack-gtm-2026.docx
+++ b/profile/rasul-shaikh-fullstack-gtm-2026.docx
@@ -2,227 +2,1218 @@
 <file path=word/document.xml><?xml version="1.0" encoding="utf-8"?>
 <w:document xmlns:wpc="http://schemas.microsoft.com/office/word/2010/wordprocessingCanvas" xmlns:mo="http://schemas.microsoft.com/office/mac/office/2008/main" xmlns:mc="http://schemas.openxmlformats.org/markup-compatibility/2006" xmlns:mv="urn:schemas-microsoft-com:mac:vml" xmlns:o="urn:schemas-microsoft-com:office:office" xmlns:r="http://schemas.openxmlformats.org/officeDocument/2006/relationships" xmlns:m="http://schemas.openxmlformats.org/officeDocument/2006/math" xmlns:v="urn:schemas-microsoft-com:vml" xmlns:wp14="http://schemas.microsoft.com/office/word/2010/wordprocessingDrawing" xmlns:wp="http://schemas.openxmlformats.org/drawingml/2006/wordprocessingDrawing" xmlns:w10="urn:schemas-microsoft-com:office:word" xmlns:w="http://schemas.openxmlformats.org/wordprocessingml/2006/main" xmlns:w14="http://schemas.microsoft.com/office/word/2010/wordml" xmlns:wpg="http://schemas.microsoft.com/office/word/2010/wordprocessingGroup" xmlns:wpi="http://schemas.microsoft.com/office/word/2010/wordprocessingInk" xmlns:wne="http://schemas.microsoft.com/office/word/2006/wordml" xmlns:wps="http://schemas.microsoft.com/office/word/2010/wordprocessingShape" mc:Ignorable="w14 wp14">
   <w:body>
+    <w:tbl>
+      <w:tblPr>
+        <w:tblW w:type="auto" w:w="0"/>
+        <w:tblLayout w:type="fixed"/>
+        <w:tblLook w:firstColumn="1" w:firstRow="1" w:lastColumn="0" w:lastRow="0" w:noHBand="0" w:noVBand="1" w:val="04A0"/>
+      </w:tblPr>
+      <w:tblGrid>
+        <w:gridCol w:w="5184"/>
+        <w:gridCol w:w="4176"/>
+      </w:tblGrid>
+      <w:tr>
+        <w:tc>
+          <w:tcPr>
+            <w:tcW w:type="dxa" w:w="5184"/>
+            <w:tcBorders>
+              <w:top w:val="nil"/>
+              <w:left w:val="nil"/>
+              <w:bottom w:val="nil"/>
+              <w:right w:val="nil"/>
+            </w:tcBorders>
+          </w:tcPr>
+          <w:p>
+            <w:pPr>
+              <w:spacing w:before="0" w:after="20"/>
+              <w:jc w:val="left"/>
+            </w:pPr>
+            <w:r>
+              <w:rPr>
+                <w:rFonts w:ascii="Calibri" w:hAnsi="Calibri"/>
+                <w:b/>
+                <w:color w:val="101020"/>
+                <w:sz w:val="44"/>
+              </w:rPr>
+              <w:t>RASUL SHAIKH</w:t>
+            </w:r>
+          </w:p>
+          <w:p>
+            <w:pPr>
+              <w:spacing w:before="0" w:after="60"/>
+              <w:jc w:val="left"/>
+            </w:pPr>
+            <w:r>
+              <w:rPr>
+                <w:rFonts w:ascii="Calibri" w:hAnsi="Calibri"/>
+                <w:color w:val="2B4A6A"/>
+                <w:sz w:val="20"/>
+              </w:rPr>
+              <w:t>AI GTM Engineer · Full-Stack from Signal to Pipeline</w:t>
+            </w:r>
+          </w:p>
+        </w:tc>
+        <w:tc>
+          <w:tcPr>
+            <w:tcW w:type="dxa" w:w="4176"/>
+            <w:tcBorders>
+              <w:top w:val="nil"/>
+              <w:left w:val="nil"/>
+              <w:bottom w:val="nil"/>
+              <w:right w:val="nil"/>
+            </w:tcBorders>
+            <w:vAlign w:val="center"/>
+          </w:tcPr>
+          <w:p>
+            <w:pPr>
+              <w:spacing w:before="0" w:after="20"/>
+              <w:jc w:val="right"/>
+            </w:pPr>
+            <w:r>
+              <w:rPr>
+                <w:rFonts w:ascii="Calibri" w:hAnsi="Calibri"/>
+                <w:color w:val="444455"/>
+                <w:sz w:val="17"/>
+              </w:rPr>
+              <w:t>+91 7387244006  ·  shaikhrasul02@gmail.com  ·  linkedin.com/in/rasulshaikh  ·  Pune, MH · Remote (worldwide) and Bengaluru / Indore / Singapore hybrid</w:t>
+            </w:r>
+          </w:p>
+        </w:tc>
+      </w:tr>
+    </w:tbl>
     <w:p>
+      <w:pPr>
+        <w:spacing w:before="0" w:after="100"/>
+        <w:pBdr>
+          <w:bottom w:val="single" w:sz="16" w:space="1" w:color="1B3A5C"/>
+        </w:pBdr>
+      </w:pPr>
+    </w:p>
+    <w:p>
+      <w:pPr>
+        <w:spacing w:before="180" w:after="40"/>
+        <w:pBdr>
+          <w:top w:val="single" w:sz="4" w:space="1" w:color="1B3A5C"/>
+        </w:pBdr>
+      </w:pPr>
       <w:r>
         <w:rPr>
+          <w:rFonts w:ascii="Calibri" w:hAnsi="Calibri"/>
           <w:b/>
-          <w:sz w:val="32"/>
-        </w:rPr>
-        <w:t>RASUL SHAIKH</w:t>
-      </w:r>
-    </w:p>
-    <w:p>
-      <w:r>
-        <w:t>AI GTM Engineer | Full-Stack Outbound, RevOps, Demand Gen</w:t>
-      </w:r>
-    </w:p>
-    <w:p>
-      <w:r>
-        <w:t>+91 7387244006 | shaikhrasul02@gmail.com | linkedin.com/in/rasulshaikh</w:t>
-      </w:r>
-    </w:p>
-    <w:p>
-      <w:r>
-        <w:t>Pune, MH (remote worldwide) | rasulshaikh.github.io/gtm-portfolio | github.com/rasulshaikh</w:t>
-      </w:r>
-    </w:p>
-    <w:p/>
-    <w:p>
-      <w:r>
-        <w:rPr>
-          <w:b/>
-          <w:sz w:val="24"/>
+          <w:color w:val="1B3A5C"/>
+          <w:sz w:val="17"/>
         </w:rPr>
         <w:t>PROFESSIONAL SUMMARY</w:t>
       </w:r>
     </w:p>
     <w:p>
+      <w:pPr>
+        <w:spacing w:before="40" w:after="40"/>
+      </w:pPr>
       <w:r>
-        <w:t>AI GTM Engineer who builds the full revenue motion: outbound infrastructure, lead scoring, CRM automation, pipeline attribution, and the Python, Clay, and n8n systems that run it. 3+ years at B2B scale-ups; 5+ years across sales, RevOps, and GTM. At Omnibound AI: cut campaign deploy 2 weeks to under 3 days, unified 6 data sources into one scored lead layer.</w:t>
+        <w:rPr>
+          <w:rFonts w:ascii="Calibri" w:hAnsi="Calibri"/>
+          <w:b w:val="0"/>
+          <w:i w:val="0"/>
+          <w:color w:val="444455"/>
+          <w:sz w:val="18"/>
+        </w:rPr>
+        <w:t>AI GTM Engineer who engineers the full revenue motion - signal architecture, multi-channel outbound, demand gen, and pipeline attribution - then ships the production Python, AI agents, and MCPs that make it run without human coordination. Bridges Marketing, Sales, Product, and CS through data infrastructure, not through meetings.</w:t>
       </w:r>
     </w:p>
     <w:p>
+      <w:pPr>
+        <w:spacing w:before="40" w:after="40"/>
+      </w:pPr>
       <w:r>
-        <w:t>$550K+ Revenue | $3.5M+ Pipeline | 40% Efficiency | 1.5%+ Reply Rates | 27% SQL Conv</w:t>
+        <w:rPr>
+          <w:rFonts w:ascii="Calibri" w:hAnsi="Calibri"/>
+          <w:b w:val="0"/>
+          <w:i w:val="0"/>
+          <w:color w:val="444455"/>
+          <w:sz w:val="18"/>
+        </w:rPr>
+        <w:t>3+ years at B2B scale-ups (cybersecurity, IT services, AI search); 5+ years across sales, RevOps, and GTM total. At Omnibound AI: cut campaign deploy time 2 weeks → 3 days, unified 6 siloed data sources into a single AI-scored signal layer, and translated PMM positioning shifts into campaign execution the same week.</w:t>
       </w:r>
     </w:p>
-    <w:p/>
     <w:p>
+      <w:pPr>
+        <w:spacing w:before="40" w:after="140"/>
+        <w:jc w:val="center"/>
+      </w:pPr>
       <w:r>
         <w:rPr>
+          <w:rFonts w:ascii="Calibri" w:hAnsi="Calibri"/>
           <w:b/>
-          <w:sz w:val="24"/>
+          <w:color w:val="1B3A5C"/>
+          <w:sz w:val="17"/>
+        </w:rPr>
+        <w:t>$550K+ Revenue · $3.5M+ Pipeline · 2 Wks → 3 Days Deploy · 1.5%+ Reply Rates · 48h → 4h Qualification</w:t>
+      </w:r>
+    </w:p>
+    <w:p>
+      <w:pPr>
+        <w:spacing w:before="180" w:after="40"/>
+        <w:pBdr>
+          <w:top w:val="single" w:sz="4" w:space="1" w:color="1B3A5C"/>
+        </w:pBdr>
+      </w:pPr>
+      <w:r>
+        <w:rPr>
+          <w:rFonts w:ascii="Calibri" w:hAnsi="Calibri"/>
+          <w:b/>
+          <w:color w:val="1B3A5C"/>
+          <w:sz w:val="17"/>
         </w:rPr>
         <w:t>CORE SKILLS</w:t>
       </w:r>
     </w:p>
     <w:p>
+      <w:pPr>
+        <w:spacing w:before="20" w:after="20"/>
+        <w:ind w:left="72"/>
+      </w:pPr>
       <w:r>
-        <w:t>GTM Engineering: outbound system design, ICP segmentation, signal prospecting, multi-channel orchestration, SDR enablement</w:t>
+        <w:rPr>
+          <w:rFonts w:ascii="Calibri" w:hAnsi="Calibri"/>
+          <w:sz w:val="18"/>
+        </w:rPr>
+        <w:t>GTM Engineering - End-to-end outbound system design · ICP segmentation by title/industry/pain · Signal-based prospecting · Targeted list building · A/B testing of sequences, messaging, and creative · Outbound copywriting · Nurture sequence design across the full lifecycle · Event-led and pre-event outreach · Multi-channel orchestration (email + LinkedIn + phone) · SDR team enablement and scaling.</w:t>
       </w:r>
     </w:p>
     <w:p>
+      <w:pPr>
+        <w:spacing w:before="20" w:after="20"/>
+        <w:ind w:left="72"/>
+      </w:pPr>
       <w:r>
-        <w:t>AI and Automation: Claude Code, OpenAI, Anthropic, Clay LLM pipelines, Python, Playwright, n8n, lead-scoring agents</w:t>
+        <w:rPr>
+          <w:rFonts w:ascii="Calibri" w:hAnsi="Calibri"/>
+          <w:sz w:val="18"/>
+        </w:rPr>
+        <w:t>AI &amp; Agentic Workflows - Claude Code · Anthropic API · OpenAI API · MCPs · Prompt + context engineering · Multi-stage orchestrated LLM pipelines that ship and run unattended · Hyper-personalization at scale via per-contact AI copy generation · Strategic automation for content, email, and SEO · Custom lead-scoring rubrics · Custom scoring agents · Retry + branching patterns in agent flows.</w:t>
       </w:r>
     </w:p>
     <w:p>
+      <w:pPr>
+        <w:spacing w:before="20" w:after="20"/>
+        <w:ind w:left="72"/>
+      </w:pPr>
       <w:r>
-        <w:t>RevOps: HubSpot, Salesforce, Attio, CRM sync, attribution, Supabase, PostgreSQL, SQL</w:t>
+        <w:rPr>
+          <w:rFonts w:ascii="Calibri" w:hAnsi="Calibri"/>
+          <w:sz w:val="18"/>
+        </w:rPr>
+        <w:t>Engineering Depth - Python (requests, BeautifulSoup, Scrapy, Playwright, asyncio) · JavaScript · SQL · bash · Async fan-out patterns · Headless browser automation · REST APIs · Webhooks · Web scraping and structured extraction from unstructured sources · Data pipeline design from scratch · Custom API integrations.</w:t>
       </w:r>
     </w:p>
     <w:p>
+      <w:pPr>
+        <w:spacing w:before="20" w:after="20"/>
+        <w:ind w:left="72"/>
+      </w:pPr>
       <w:r>
-        <w:t>Demand Gen: LinkedIn Ads, Google Ads, SEMrush, Ahrefs, GA4, content pipelines</w:t>
+        <w:rPr>
+          <w:rFonts w:ascii="Calibri" w:hAnsi="Calibri"/>
+          <w:sz w:val="18"/>
+        </w:rPr>
+        <w:t>Funnel Architecture &amp; Demand Gen - Salesforce / HubSpot / Marketo / Outreach / Attio · LinkedIn Ads · Meta Ads · Google Ads API · GA4 · GSC · Looker · SEMrush · Ahrefs · Programmatic content + SEO pipelines · Performance ad automation with conversion tracking wired to pipeline data.</w:t>
       </w:r>
     </w:p>
-    <w:p/>
     <w:p>
+      <w:pPr>
+        <w:spacing w:before="20" w:after="20"/>
+        <w:ind w:left="72"/>
+      </w:pPr>
       <w:r>
         <w:rPr>
+          <w:rFonts w:ascii="Calibri" w:hAnsi="Calibri"/>
+          <w:sz w:val="18"/>
+        </w:rPr>
+        <w:t>Product Marketing Partnership - Positioning · Messaging frameworks · Early-to-scale-stage narrative shifts · Trend analysis · Initial branding · Cross-functional collaboration with PMM, Product, Content, SEO, Founder · Building systems that turn content, insights, and product signals into high-performing campaign programs.</w:t>
+      </w:r>
+    </w:p>
+    <w:p>
+      <w:pPr>
+        <w:spacing w:before="20" w:after="20"/>
+        <w:ind w:left="72"/>
+      </w:pPr>
+      <w:r>
+        <w:rPr>
+          <w:rFonts w:ascii="Calibri" w:hAnsi="Calibri"/>
+          <w:sz w:val="18"/>
+        </w:rPr>
+        <w:t>Cross-Functional Enablement - Worked with Sales, Marketing, Product, Engineering, CS, Support, SEO, and Content · Real-time CRM sync via webhooks eliminates manual data entry · Attribution dashboards make pipeline ROI visible to every team.</w:t>
+      </w:r>
+    </w:p>
+    <w:p>
+      <w:pPr>
+        <w:spacing w:before="180" w:after="40"/>
+        <w:pBdr>
+          <w:top w:val="single" w:sz="4" w:space="1" w:color="1B3A5C"/>
+        </w:pBdr>
+      </w:pPr>
+      <w:r>
+        <w:rPr>
+          <w:rFonts w:ascii="Calibri" w:hAnsi="Calibri"/>
           <w:b/>
-          <w:sz w:val="24"/>
+          <w:color w:val="1B3A5C"/>
+          <w:sz w:val="17"/>
         </w:rPr>
         <w:t>WORK HISTORY</w:t>
       </w:r>
     </w:p>
-    <w:p/>
     <w:p>
+      <w:pPr>
+        <w:spacing w:before="100" w:after="20"/>
+      </w:pPr>
       <w:r>
-        <w:t>Omnibound AI | AI GTM Engineer (Founder's Office) | Oct 2025 - Present | Remote</w:t>
+        <w:rPr>
+          <w:rFonts w:ascii="Calibri" w:hAnsi="Calibri"/>
+          <w:b/>
+          <w:color w:val="101020"/>
+          <w:sz w:val="19"/>
+        </w:rPr>
+        <w:t>Omnibound AI</w:t>
+      </w:r>
+      <w:r>
+        <w:rPr>
+          <w:rFonts w:ascii="Calibri" w:hAnsi="Calibri"/>
+          <w:i/>
+          <w:color w:val="444455"/>
+          <w:sz w:val="17"/>
+        </w:rPr>
+        <w:t xml:space="preserve"> - AI GTM Engineer (Founder's Office / GTM Strategy)  |  Oct 2025 - Present  |  Remote (EOR: Native Teams)</w:t>
       </w:r>
     </w:p>
     <w:p>
       <w:pPr>
-        <w:pStyle w:val="ListBullet"/>
+        <w:spacing w:before="0" w:after="40"/>
       </w:pPr>
       <w:r>
-        <w:t>Cut deploy 2 weeks to under 3 days; 1.5%+ positive reply rates across 300+ mailboxes, 150+ domains</w:t>
+        <w:rPr>
+          <w:rFonts w:ascii="Calibri" w:hAnsi="Calibri"/>
+          <w:b w:val="0"/>
+          <w:i/>
+          <w:color w:val="666666"/>
+          <w:sz w:val="17"/>
+        </w:rPr>
+        <w:t>AI Search Marketing Platform - signal-led GTM infrastructure for B2B scale-ups.</w:t>
       </w:r>
     </w:p>
     <w:p>
       <w:pPr>
-        <w:pStyle w:val="ListBullet"/>
+        <w:spacing w:before="0" w:after="30"/>
+        <w:ind w:left="317" w:hanging="230"/>
       </w:pPr>
       <w:r>
-        <w:t>Unified 6 data sources into 0-100 lead score; qualification to outreach under 4 hours (was 48h+)</w:t>
+        <w:rPr>
+          <w:rFonts w:ascii="Calibri" w:hAnsi="Calibri"/>
+          <w:sz w:val="18"/>
+        </w:rPr>
+        <w:t>Cut campaign deploy time 2 weeks → under 3 days and sustained 1.5%+ positive reply rates across 300+ mailboxes - signal-led outbound engine on Trigify + PhantomBuster → Claude Code → n8n → Supabase → Clay → HubSpot → Slack (150+ sending domains).</w:t>
       </w:r>
     </w:p>
     <w:p>
       <w:pPr>
-        <w:pStyle w:val="ListBullet"/>
+        <w:spacing w:before="0" w:after="30"/>
+        <w:ind w:left="317" w:hanging="230"/>
       </w:pPr>
       <w:r>
-        <w:t>Built 7-stage Clay pipeline for stack-displacement targeting and personalized email at scale</w:t>
+        <w:rPr>
+          <w:rFonts w:ascii="Calibri" w:hAnsi="Calibri"/>
+          <w:sz w:val="18"/>
+        </w:rPr>
+        <w:t>7-stage orchestrated LLM pipeline in Clay for SEMrush/Ahrefs stack-displacement targeting: role mapping → SEO intel → gap analysis → AI search gap analysis → strategic positioning → email generation. Per-contact hyper-personalized copy that scales without human review.</w:t>
       </w:r>
     </w:p>
     <w:p>
       <w:pPr>
-        <w:pStyle w:val="ListBullet"/>
+        <w:spacing w:before="0" w:after="30"/>
+        <w:ind w:left="317" w:hanging="230"/>
       </w:pPr>
       <w:r>
-        <w:t>Shipped deepline-CLI: Playwright enrichment 100+ domains/batch; HubSpot auto-push; sub-30-min vs 6h manual</w:t>
+        <w:rPr>
+          <w:rFonts w:ascii="Calibri" w:hAnsi="Calibri"/>
+          <w:sz w:val="18"/>
+        </w:rPr>
+        <w:t>Replaced 6+ hrs/batch of manual research with a sub-30-min automated pass - Python (Playwright, asyncio) enrichment agent on Supabase: headless scraping across 100+ domains, Claude Code scoring rubric (composite 0-100 from firmographic + technographic + behavioral), qualified accounts auto-pushed to HubSpot with full routing context, runs unattended.</w:t>
       </w:r>
     </w:p>
     <w:p>
       <w:pPr>
-        <w:pStyle w:val="ListBullet"/>
+        <w:spacing w:before="0" w:after="30"/>
+        <w:ind w:left="317" w:hanging="230"/>
       </w:pPr>
       <w:r>
-        <w:t>Published 9 open-source GTM repos and portfolio with Context Engine and case studies</w:t>
-      </w:r>
-    </w:p>
-    <w:p/>
-    <w:p>
-      <w:r>
-        <w:t>RemoteState | AI GTM Engineer, Founder's Office | Apr 2023 - Jun 2025 | Noida</w:t>
+        <w:rPr>
+          <w:rFonts w:ascii="Calibri" w:hAnsi="Calibri"/>
+          <w:sz w:val="18"/>
+        </w:rPr>
+        <w:t>PMM + Founder partnership: worked directly with Product Marketing, Product, Content, SEO, and Founder on positioning, trend analysis, and scale-stage messaging evolution - translated narrative shifts into campaign execution in the same week.</w:t>
       </w:r>
     </w:p>
     <w:p>
       <w:pPr>
-        <w:pStyle w:val="ListBullet"/>
+        <w:spacing w:before="0" w:after="30"/>
+        <w:ind w:left="317" w:hanging="230"/>
       </w:pPr>
       <w:r>
-        <w:t>$180K+ ARR in 6 months; 40% pipeline efficiency; 250+ domains at 95%+ deliverability</w:t>
+        <w:rPr>
+          <w:rFonts w:ascii="Calibri" w:hAnsi="Calibri"/>
+          <w:sz w:val="18"/>
+        </w:rPr>
+        <w:t>Cut lead qualification → outreach from 48h+ to under 4 hours - unified 6 siloed sources (Product API webhooks, GA4/Mixpanel, SEMrush API, Content, CRM, SEO) into one AI-scored signal layer (composite 0-100, firmographic + technographic + behavioral), auto-routing to 4 Slack channels by signal type.</w:t>
       </w:r>
     </w:p>
     <w:p>
       <w:pPr>
-        <w:pStyle w:val="ListBullet"/>
+        <w:spacing w:before="100" w:after="20"/>
       </w:pPr>
       <w:r>
-        <w:t>1.5%+ reply rates; 18-39% SQL conversion; 12-20 SQLs per campaign</w:t>
+        <w:rPr>
+          <w:rFonts w:ascii="Calibri" w:hAnsi="Calibri"/>
+          <w:b/>
+          <w:color w:val="101020"/>
+          <w:sz w:val="19"/>
+        </w:rPr>
+        <w:t>RemoteState  (IT Services - $12.2M ARR)</w:t>
+      </w:r>
+      <w:r>
+        <w:rPr>
+          <w:rFonts w:ascii="Calibri" w:hAnsi="Calibri"/>
+          <w:i/>
+          <w:color w:val="444455"/>
+          <w:sz w:val="17"/>
+        </w:rPr>
+        <w:t xml:space="preserve"> - AI GTM Engineer, Founder's Office  |  Apr 2023 - Jun 2025  |  Noida</w:t>
       </w:r>
     </w:p>
     <w:p>
       <w:pPr>
-        <w:pStyle w:val="ListBullet"/>
+        <w:spacing w:before="0" w:after="40"/>
       </w:pPr>
       <w:r>
-        <w:t>Cut qualification 48h to 9.6h with OpenAI scoring; scaled SDR team 1 to 4</w:t>
-      </w:r>
-    </w:p>
-    <w:p/>
-    <w:p>
-      <w:r>
-        <w:t>FalconWise Tech | Head of Growth (Contract) | Dec 2022 - Apr 2023 | Dubai</w:t>
+        <w:rPr>
+          <w:rFonts w:ascii="Calibri" w:hAnsi="Calibri"/>
+          <w:b w:val="0"/>
+          <w:i/>
+          <w:color w:val="666666"/>
+          <w:sz w:val="17"/>
+        </w:rPr>
+        <w:t>Owned the entire outbound engine from greenfield; cross-functional collaboration with Product, Marketing, Engineering, and CS.</w:t>
       </w:r>
     </w:p>
     <w:p>
       <w:pPr>
-        <w:pStyle w:val="ListBullet"/>
+        <w:spacing w:before="0" w:after="30"/>
+        <w:ind w:left="317" w:hanging="230"/>
       </w:pPr>
       <w:r>
-        <w:t>ABM from zero: 10+ SQLs/month, 30% engagement; 25% pipeline from partner channel</w:t>
-      </w:r>
-    </w:p>
-    <w:p/>
-    <w:p>
-      <w:r>
-        <w:t>CareerLabs Tech | Senior BDR | Jun 2022 - Dec 2022 | Bangalore</w:t>
+        <w:rPr>
+          <w:rFonts w:ascii="Calibri" w:hAnsi="Calibri"/>
+          <w:sz w:val="18"/>
+        </w:rPr>
+        <w:t>Delivered 40% pipeline efficiency gain and $180K+ ARR growth in 6 months - AI GTM engine on Clay + Smartlead + CloudTalk + n8n across 250+ sending domains (95%+ deliverability), 1.5%+ reply rates, 18-39% SQL conversion on trigger-based workflows (12-20 SQLs/campaign).</w:t>
       </w:r>
     </w:p>
     <w:p>
       <w:pPr>
-        <w:pStyle w:val="ListBullet"/>
+        <w:spacing w:before="0" w:after="30"/>
+        <w:ind w:left="317" w:hanging="230"/>
       </w:pPr>
       <w:r>
-        <w:t>SQL conversion 16% to 27%; $25K+ enrollments</w:t>
+        <w:rPr>
+          <w:rFonts w:ascii="Calibri" w:hAnsi="Calibri"/>
+          <w:sz w:val="18"/>
+        </w:rPr>
+        <w:t>Custom OpenAI lead-scoring rubric cut qualification cycle from 48h → 9.6h (80% reduction); webhook schema designed with Product + Engineering for clean CRM ingestion.</w:t>
       </w:r>
     </w:p>
-    <w:p/>
     <w:p>
+      <w:pPr>
+        <w:spacing w:before="0" w:after="30"/>
+        <w:ind w:left="317" w:hanging="230"/>
+      </w:pPr>
       <w:r>
         <w:rPr>
+          <w:rFonts w:ascii="Calibri" w:hAnsi="Calibri"/>
+          <w:sz w:val="18"/>
+        </w:rPr>
+        <w:t>5-source competitive-intel + market-research enrichment (Apollo + Persana + GPT + Clearbit + internal CRM) - 45% improvement in targeting accuracy. Enriched ICPs for US/EU enterprise IT-services outbound.</w:t>
+      </w:r>
+    </w:p>
+    <w:p>
+      <w:pPr>
+        <w:spacing w:before="0" w:after="30"/>
+        <w:ind w:left="317" w:hanging="230"/>
+      </w:pPr>
+      <w:r>
+        <w:rPr>
+          <w:rFonts w:ascii="Calibri" w:hAnsi="Calibri"/>
+          <w:sz w:val="18"/>
+        </w:rPr>
+        <w:t>Scaled SDR team 1 → 4 with automation-first playbooks (300% productivity gain). Real-time CRM sync via HubSpot + n8n webhooks eliminated 15h/week of manual data entry - Sales / CS / Support all routing from one data layer.</w:t>
+      </w:r>
+    </w:p>
+    <w:p>
+      <w:pPr>
+        <w:spacing w:before="100" w:after="20"/>
+      </w:pPr>
+      <w:r>
+        <w:rPr>
+          <w:rFonts w:ascii="Calibri" w:hAnsi="Calibri"/>
           <w:b/>
-          <w:sz w:val="24"/>
+          <w:color w:val="101020"/>
+          <w:sz w:val="19"/>
+        </w:rPr>
+        <w:t>FalconWise Tech  (Cybersecurity, Dubai)</w:t>
+      </w:r>
+      <w:r>
+        <w:rPr>
+          <w:rFonts w:ascii="Calibri" w:hAnsi="Calibri"/>
+          <w:i/>
+          <w:color w:val="444455"/>
+          <w:sz w:val="17"/>
+        </w:rPr>
+        <w:t xml:space="preserve"> - Head of Growth, Contract  |  Dec 2022 - Apr 2023  |  Remote</w:t>
+      </w:r>
+    </w:p>
+    <w:p>
+      <w:pPr>
+        <w:spacing w:before="0" w:after="40"/>
+      </w:pPr>
+      <w:r>
+        <w:rPr>
+          <w:rFonts w:ascii="Calibri" w:hAnsi="Calibri"/>
+          <w:b w:val="0"/>
+          <w:i/>
+          <w:color w:val="666666"/>
+          <w:sz w:val="17"/>
+        </w:rPr>
+        <w:t>Zero-to-one ABM engine for the MENA cybersecurity market; partnered with Design, Content, and regional cybersecurity vendors.</w:t>
+      </w:r>
+    </w:p>
+    <w:p>
+      <w:pPr>
+        <w:spacing w:before="0" w:after="30"/>
+        <w:ind w:left="317" w:hanging="230"/>
+      </w:pPr>
+      <w:r>
+        <w:rPr>
+          <w:rFonts w:ascii="Calibri" w:hAnsi="Calibri"/>
+          <w:sz w:val="18"/>
+        </w:rPr>
+        <w:t>Built ABM engine from zero - Apollo + Persana + GPT workflows across 5 data sources, 10+ SQLs/month, 30% engagement rate, 45% improvement in targeting accuracy. Multi-channel campaigns targeting enterprise CISOs, CTOs, and Heads of Security across MENA.</w:t>
+      </w:r>
+    </w:p>
+    <w:p>
+      <w:pPr>
+        <w:spacing w:before="0" w:after="30"/>
+        <w:ind w:left="317" w:hanging="230"/>
+      </w:pPr>
+      <w:r>
+        <w:rPr>
+          <w:rFonts w:ascii="Calibri" w:hAnsi="Calibri"/>
+          <w:sz w:val="18"/>
+        </w:rPr>
+        <w:t>Co-marketing partnership channel with 3 regional cybersecurity vendors (security-services + vendor CS co-sell) - 25% of total pipeline from partner referrals.</w:t>
+      </w:r>
+    </w:p>
+    <w:p>
+      <w:pPr>
+        <w:spacing w:before="100" w:after="20"/>
+      </w:pPr>
+      <w:r>
+        <w:rPr>
+          <w:rFonts w:ascii="Calibri" w:hAnsi="Calibri"/>
+          <w:b/>
+          <w:color w:val="101020"/>
+          <w:sz w:val="19"/>
+        </w:rPr>
+        <w:t>CareerLabs Tech  (EdTech, $2.2M funding)</w:t>
+      </w:r>
+      <w:r>
+        <w:rPr>
+          <w:rFonts w:ascii="Calibri" w:hAnsi="Calibri"/>
+          <w:i/>
+          <w:color w:val="444455"/>
+          <w:sz w:val="17"/>
+        </w:rPr>
+        <w:t xml:space="preserve"> - Senior BDR  |  Jun 2022 - Dec 2022  |  Bangalore</w:t>
+      </w:r>
+    </w:p>
+    <w:p>
+      <w:pPr>
+        <w:spacing w:before="0" w:after="40"/>
+      </w:pPr>
+      <w:r>
+        <w:rPr>
+          <w:rFonts w:ascii="Calibri" w:hAnsi="Calibri"/>
+          <w:b w:val="0"/>
+          <w:i/>
+          <w:color w:val="666666"/>
+          <w:sz w:val="17"/>
+        </w:rPr>
+        <w:t>Rebuilt outbound motion end-to-end; partnered with Marketing (UTM), Content (messaging), and Product (demo env).</w:t>
+      </w:r>
+    </w:p>
+    <w:p>
+      <w:pPr>
+        <w:spacing w:before="0" w:after="30"/>
+        <w:ind w:left="317" w:hanging="230"/>
+      </w:pPr>
+      <w:r>
+        <w:rPr>
+          <w:rFonts w:ascii="Calibri" w:hAnsi="Calibri"/>
+          <w:sz w:val="18"/>
+        </w:rPr>
+        <w:t>Rebuilt outbound automation on Reply + HubSpot - SQL conversion 16% → 27% (+69% lift), response time 4h → 2.4h, 50+ remote demos at 65% show-up rate (automated reminder sequences via Marketing infrastructure).</w:t>
+      </w:r>
+    </w:p>
+    <w:p>
+      <w:pPr>
+        <w:spacing w:before="0" w:after="30"/>
+        <w:ind w:left="317" w:hanging="230"/>
+      </w:pPr>
+      <w:r>
+        <w:rPr>
+          <w:rFonts w:ascii="Calibri" w:hAnsi="Calibri"/>
+          <w:sz w:val="18"/>
+        </w:rPr>
+        <w:t>$25K+ in course enrollments; improved onboarding via Product + CS collaboration on new-user journey.</w:t>
+      </w:r>
+    </w:p>
+    <w:p>
+      <w:pPr>
+        <w:spacing w:before="180" w:after="40"/>
+        <w:pBdr>
+          <w:top w:val="single" w:sz="4" w:space="1" w:color="1B3A5C"/>
+        </w:pBdr>
+      </w:pPr>
+      <w:r>
+        <w:rPr>
+          <w:rFonts w:ascii="Calibri" w:hAnsi="Calibri"/>
+          <w:b/>
+          <w:color w:val="1B3A5C"/>
+          <w:sz w:val="17"/>
         </w:rPr>
         <w:t>TOOLCHAIN</w:t>
       </w:r>
     </w:p>
+    <w:tbl>
+      <w:tblPr>
+        <w:tblW w:type="auto" w:w="0"/>
+        <w:tblLayout w:type="fixed"/>
+        <w:tblLook w:firstColumn="1" w:firstRow="1" w:lastColumn="0" w:lastRow="0" w:noHBand="0" w:noVBand="1" w:val="04A0"/>
+      </w:tblPr>
+      <w:tblGrid>
+        <w:gridCol w:w="2160"/>
+        <w:gridCol w:w="7200"/>
+      </w:tblGrid>
+      <w:tr>
+        <w:tc>
+          <w:tcPr>
+            <w:tcW w:type="dxa" w:w="2160"/>
+            <w:tcBorders>
+              <w:top w:val="nil"/>
+              <w:left w:val="nil"/>
+              <w:bottom w:val="nil"/>
+              <w:right w:val="nil"/>
+            </w:tcBorders>
+          </w:tcPr>
+          <w:p>
+            <w:pPr>
+              <w:spacing w:before="0" w:after="0"/>
+              <w:jc w:val="right"/>
+            </w:pPr>
+            <w:r>
+              <w:rPr>
+                <w:rFonts w:ascii="Calibri" w:hAnsi="Calibri"/>
+                <w:b/>
+                <w:color w:val="1B3A5C"/>
+                <w:sz w:val="18"/>
+              </w:rPr>
+              <w:t>GTM Platforms:</w:t>
+            </w:r>
+          </w:p>
+        </w:tc>
+        <w:tc>
+          <w:tcPr>
+            <w:tcW w:type="dxa" w:w="7200"/>
+            <w:tcBorders>
+              <w:top w:val="nil"/>
+              <w:left w:val="nil"/>
+              <w:bottom w:val="nil"/>
+              <w:right w:val="nil"/>
+            </w:tcBorders>
+          </w:tcPr>
+          <w:p>
+            <w:pPr>
+              <w:spacing w:before="0" w:after="0"/>
+              <w:ind w:left="115"/>
+            </w:pPr>
+            <w:r>
+              <w:rPr>
+                <w:rFonts w:ascii="Calibri" w:hAnsi="Calibri"/>
+                <w:color w:val="101020"/>
+                <w:sz w:val="18"/>
+              </w:rPr>
+              <w:t>Salesforce · HubSpot · Marketo · Outreach · Pipedrive · Attio · ClickUp</w:t>
+            </w:r>
+          </w:p>
+        </w:tc>
+      </w:tr>
+      <w:tr>
+        <w:tc>
+          <w:tcPr>
+            <w:tcW w:type="dxa" w:w="2160"/>
+            <w:tcBorders>
+              <w:top w:val="nil"/>
+              <w:left w:val="nil"/>
+              <w:bottom w:val="nil"/>
+              <w:right w:val="nil"/>
+            </w:tcBorders>
+          </w:tcPr>
+          <w:p>
+            <w:pPr>
+              <w:spacing w:before="0" w:after="0"/>
+              <w:jc w:val="right"/>
+            </w:pPr>
+            <w:r>
+              <w:rPr>
+                <w:rFonts w:ascii="Calibri" w:hAnsi="Calibri"/>
+                <w:b/>
+                <w:color w:val="1B3A5C"/>
+                <w:sz w:val="18"/>
+              </w:rPr>
+              <w:t>Outbound &amp; Enrichment:</w:t>
+            </w:r>
+          </w:p>
+        </w:tc>
+        <w:tc>
+          <w:tcPr>
+            <w:tcW w:type="dxa" w:w="7200"/>
+            <w:tcBorders>
+              <w:top w:val="nil"/>
+              <w:left w:val="nil"/>
+              <w:bottom w:val="nil"/>
+              <w:right w:val="nil"/>
+            </w:tcBorders>
+          </w:tcPr>
+          <w:p>
+            <w:pPr>
+              <w:spacing w:before="0" w:after="0"/>
+              <w:ind w:left="115"/>
+            </w:pPr>
+            <w:r>
+              <w:rPr>
+                <w:rFonts w:ascii="Calibri" w:hAnsi="Calibri"/>
+                <w:color w:val="101020"/>
+                <w:sz w:val="18"/>
+              </w:rPr>
+              <w:t>Clay · Apollo · LinkedIn Sales Navigator · Firecrawl · Smartlead · Instantly · Lemlist · Findymail · Prospeo · BetterContact · ZeroBounce</w:t>
+            </w:r>
+          </w:p>
+        </w:tc>
+      </w:tr>
+      <w:tr>
+        <w:tc>
+          <w:tcPr>
+            <w:tcW w:type="dxa" w:w="2160"/>
+            <w:tcBorders>
+              <w:top w:val="nil"/>
+              <w:left w:val="nil"/>
+              <w:bottom w:val="nil"/>
+              <w:right w:val="nil"/>
+            </w:tcBorders>
+          </w:tcPr>
+          <w:p>
+            <w:pPr>
+              <w:spacing w:before="0" w:after="0"/>
+              <w:jc w:val="right"/>
+            </w:pPr>
+            <w:r>
+              <w:rPr>
+                <w:rFonts w:ascii="Calibri" w:hAnsi="Calibri"/>
+                <w:b/>
+                <w:color w:val="1B3A5C"/>
+                <w:sz w:val="18"/>
+              </w:rPr>
+              <w:t>Intent &amp; Signals:</w:t>
+            </w:r>
+          </w:p>
+        </w:tc>
+        <w:tc>
+          <w:tcPr>
+            <w:tcW w:type="dxa" w:w="7200"/>
+            <w:tcBorders>
+              <w:top w:val="nil"/>
+              <w:left w:val="nil"/>
+              <w:bottom w:val="nil"/>
+              <w:right w:val="nil"/>
+            </w:tcBorders>
+          </w:tcPr>
+          <w:p>
+            <w:pPr>
+              <w:spacing w:before="0" w:after="0"/>
+              <w:ind w:left="115"/>
+            </w:pPr>
+            <w:r>
+              <w:rPr>
+                <w:rFonts w:ascii="Calibri" w:hAnsi="Calibri"/>
+                <w:color w:val="101020"/>
+                <w:sz w:val="18"/>
+              </w:rPr>
+              <w:t>Trigify · PhantomBuster · CommonRoom · Bombora · RB2B · Sumble · Jungler</w:t>
+            </w:r>
+          </w:p>
+        </w:tc>
+      </w:tr>
+      <w:tr>
+        <w:tc>
+          <w:tcPr>
+            <w:tcW w:type="dxa" w:w="2160"/>
+            <w:tcBorders>
+              <w:top w:val="nil"/>
+              <w:left w:val="nil"/>
+              <w:bottom w:val="nil"/>
+              <w:right w:val="nil"/>
+            </w:tcBorders>
+          </w:tcPr>
+          <w:p>
+            <w:pPr>
+              <w:spacing w:before="0" w:after="0"/>
+              <w:jc w:val="right"/>
+            </w:pPr>
+            <w:r>
+              <w:rPr>
+                <w:rFonts w:ascii="Calibri" w:hAnsi="Calibri"/>
+                <w:b/>
+                <w:color w:val="1B3A5C"/>
+                <w:sz w:val="18"/>
+              </w:rPr>
+              <w:t>AI / LLM / Agentic:</w:t>
+            </w:r>
+          </w:p>
+        </w:tc>
+        <w:tc>
+          <w:tcPr>
+            <w:tcW w:type="dxa" w:w="7200"/>
+            <w:tcBorders>
+              <w:top w:val="nil"/>
+              <w:left w:val="nil"/>
+              <w:bottom w:val="nil"/>
+              <w:right w:val="nil"/>
+            </w:tcBorders>
+          </w:tcPr>
+          <w:p>
+            <w:pPr>
+              <w:spacing w:before="0" w:after="0"/>
+              <w:ind w:left="115"/>
+            </w:pPr>
+            <w:r>
+              <w:rPr>
+                <w:rFonts w:ascii="Calibri" w:hAnsi="Calibri"/>
+                <w:color w:val="101020"/>
+                <w:sz w:val="18"/>
+              </w:rPr>
+              <w:t>Claude Code · Anthropic API · OpenAI API · MCPs · Openrouter / Groq / Nvidia · deepline CLI · Jungler · n8n · Make · Zapier · Python (requests, BeautifulSoup, Scrapy, Playwright, asyncio) · Apify · Zenrows · Firecrawl</w:t>
+            </w:r>
+          </w:p>
+        </w:tc>
+      </w:tr>
+      <w:tr>
+        <w:tc>
+          <w:tcPr>
+            <w:tcW w:type="dxa" w:w="2160"/>
+            <w:tcBorders>
+              <w:top w:val="nil"/>
+              <w:left w:val="nil"/>
+              <w:bottom w:val="nil"/>
+              <w:right w:val="nil"/>
+            </w:tcBorders>
+          </w:tcPr>
+          <w:p>
+            <w:pPr>
+              <w:spacing w:before="0" w:after="0"/>
+              <w:jc w:val="right"/>
+            </w:pPr>
+            <w:r>
+              <w:rPr>
+                <w:rFonts w:ascii="Calibri" w:hAnsi="Calibri"/>
+                <w:b/>
+                <w:color w:val="1B3A5C"/>
+                <w:sz w:val="18"/>
+              </w:rPr>
+              <w:t>Multi-Channel:</w:t>
+            </w:r>
+          </w:p>
+        </w:tc>
+        <w:tc>
+          <w:tcPr>
+            <w:tcW w:type="dxa" w:w="7200"/>
+            <w:tcBorders>
+              <w:top w:val="nil"/>
+              <w:left w:val="nil"/>
+              <w:bottom w:val="nil"/>
+              <w:right w:val="nil"/>
+            </w:tcBorders>
+          </w:tcPr>
+          <w:p>
+            <w:pPr>
+              <w:spacing w:before="0" w:after="0"/>
+              <w:ind w:left="115"/>
+            </w:pPr>
+            <w:r>
+              <w:rPr>
+                <w:rFonts w:ascii="Calibri" w:hAnsi="Calibri"/>
+                <w:color w:val="101020"/>
+                <w:sz w:val="18"/>
+              </w:rPr>
+              <w:t>HeyReach · LinkedIn · CloudTalk</w:t>
+            </w:r>
+          </w:p>
+        </w:tc>
+      </w:tr>
+      <w:tr>
+        <w:tc>
+          <w:tcPr>
+            <w:tcW w:type="dxa" w:w="2160"/>
+            <w:tcBorders>
+              <w:top w:val="nil"/>
+              <w:left w:val="nil"/>
+              <w:bottom w:val="nil"/>
+              <w:right w:val="nil"/>
+            </w:tcBorders>
+          </w:tcPr>
+          <w:p>
+            <w:pPr>
+              <w:spacing w:before="0" w:after="0"/>
+              <w:jc w:val="right"/>
+            </w:pPr>
+            <w:r>
+              <w:rPr>
+                <w:rFonts w:ascii="Calibri" w:hAnsi="Calibri"/>
+                <w:b/>
+                <w:color w:val="1B3A5C"/>
+                <w:sz w:val="18"/>
+              </w:rPr>
+              <w:t>Data Infra:</w:t>
+            </w:r>
+          </w:p>
+        </w:tc>
+        <w:tc>
+          <w:tcPr>
+            <w:tcW w:type="dxa" w:w="7200"/>
+            <w:tcBorders>
+              <w:top w:val="nil"/>
+              <w:left w:val="nil"/>
+              <w:bottom w:val="nil"/>
+              <w:right w:val="nil"/>
+            </w:tcBorders>
+          </w:tcPr>
+          <w:p>
+            <w:pPr>
+              <w:spacing w:before="0" w:after="0"/>
+              <w:ind w:left="115"/>
+            </w:pPr>
+            <w:r>
+              <w:rPr>
+                <w:rFonts w:ascii="Calibri" w:hAnsi="Calibri"/>
+                <w:color w:val="101020"/>
+                <w:sz w:val="18"/>
+              </w:rPr>
+              <w:t>Supabase · PostgreSQL · Redis (queue mode) · Webhooks · REST APIs · SQL</w:t>
+            </w:r>
+          </w:p>
+        </w:tc>
+      </w:tr>
+      <w:tr>
+        <w:tc>
+          <w:tcPr>
+            <w:tcW w:type="dxa" w:w="2160"/>
+            <w:tcBorders>
+              <w:top w:val="nil"/>
+              <w:left w:val="nil"/>
+              <w:bottom w:val="nil"/>
+              <w:right w:val="nil"/>
+            </w:tcBorders>
+          </w:tcPr>
+          <w:p>
+            <w:pPr>
+              <w:spacing w:before="0" w:after="0"/>
+              <w:jc w:val="right"/>
+            </w:pPr>
+            <w:r>
+              <w:rPr>
+                <w:rFonts w:ascii="Calibri" w:hAnsi="Calibri"/>
+                <w:b/>
+                <w:color w:val="1B3A5C"/>
+                <w:sz w:val="18"/>
+              </w:rPr>
+              <w:t>Demand Gen &amp; SEO:</w:t>
+            </w:r>
+          </w:p>
+        </w:tc>
+        <w:tc>
+          <w:tcPr>
+            <w:tcW w:type="dxa" w:w="7200"/>
+            <w:tcBorders>
+              <w:top w:val="nil"/>
+              <w:left w:val="nil"/>
+              <w:bottom w:val="nil"/>
+              <w:right w:val="nil"/>
+            </w:tcBorders>
+          </w:tcPr>
+          <w:p>
+            <w:pPr>
+              <w:spacing w:before="0" w:after="0"/>
+              <w:ind w:left="115"/>
+            </w:pPr>
+            <w:r>
+              <w:rPr>
+                <w:rFonts w:ascii="Calibri" w:hAnsi="Calibri"/>
+                <w:color w:val="101020"/>
+                <w:sz w:val="18"/>
+              </w:rPr>
+              <w:t>LinkedIn Ads · Meta Ads · Google Ads API · SEMrush · Ahrefs · GA4 · GSC · Mixpanel · Looker</w:t>
+            </w:r>
+          </w:p>
+        </w:tc>
+      </w:tr>
+      <w:tr>
+        <w:tc>
+          <w:tcPr>
+            <w:tcW w:type="dxa" w:w="2160"/>
+            <w:tcBorders>
+              <w:top w:val="nil"/>
+              <w:left w:val="nil"/>
+              <w:bottom w:val="nil"/>
+              <w:right w:val="nil"/>
+            </w:tcBorders>
+          </w:tcPr>
+          <w:p>
+            <w:pPr>
+              <w:spacing w:before="0" w:after="0"/>
+              <w:jc w:val="right"/>
+            </w:pPr>
+            <w:r>
+              <w:rPr>
+                <w:rFonts w:ascii="Calibri" w:hAnsi="Calibri"/>
+                <w:b/>
+                <w:color w:val="1B3A5C"/>
+                <w:sz w:val="18"/>
+              </w:rPr>
+              <w:t>Project Management:</w:t>
+            </w:r>
+          </w:p>
+        </w:tc>
+        <w:tc>
+          <w:tcPr>
+            <w:tcW w:type="dxa" w:w="7200"/>
+            <w:tcBorders>
+              <w:top w:val="nil"/>
+              <w:left w:val="nil"/>
+              <w:bottom w:val="nil"/>
+              <w:right w:val="nil"/>
+            </w:tcBorders>
+          </w:tcPr>
+          <w:p>
+            <w:pPr>
+              <w:spacing w:before="0" w:after="0"/>
+              <w:ind w:left="115"/>
+            </w:pPr>
+            <w:r>
+              <w:rPr>
+                <w:rFonts w:ascii="Calibri" w:hAnsi="Calibri"/>
+                <w:color w:val="101020"/>
+                <w:sz w:val="18"/>
+              </w:rPr>
+              <w:t>Trello · Asana · Monday · ClickUp</w:t>
+            </w:r>
+          </w:p>
+        </w:tc>
+      </w:tr>
+      <w:tr>
+        <w:tc>
+          <w:tcPr>
+            <w:tcW w:type="dxa" w:w="2160"/>
+            <w:tcBorders>
+              <w:top w:val="nil"/>
+              <w:left w:val="nil"/>
+              <w:bottom w:val="nil"/>
+              <w:right w:val="nil"/>
+            </w:tcBorders>
+          </w:tcPr>
+          <w:p>
+            <w:pPr>
+              <w:spacing w:before="0" w:after="0"/>
+              <w:jc w:val="right"/>
+            </w:pPr>
+            <w:r>
+              <w:rPr>
+                <w:rFonts w:ascii="Calibri" w:hAnsi="Calibri"/>
+                <w:b/>
+                <w:color w:val="1B3A5C"/>
+                <w:sz w:val="18"/>
+              </w:rPr>
+              <w:t>Design Collab:</w:t>
+            </w:r>
+          </w:p>
+        </w:tc>
+        <w:tc>
+          <w:tcPr>
+            <w:tcW w:type="dxa" w:w="7200"/>
+            <w:tcBorders>
+              <w:top w:val="nil"/>
+              <w:left w:val="nil"/>
+              <w:bottom w:val="nil"/>
+              <w:right w:val="nil"/>
+            </w:tcBorders>
+          </w:tcPr>
+          <w:p>
+            <w:pPr>
+              <w:spacing w:before="0" w:after="0"/>
+              <w:ind w:left="115"/>
+            </w:pPr>
+            <w:r>
+              <w:rPr>
+                <w:rFonts w:ascii="Calibri" w:hAnsi="Calibri"/>
+                <w:color w:val="101020"/>
+                <w:sz w:val="18"/>
+              </w:rPr>
+              <w:t>Figma (asset request automation via n8n)</w:t>
+            </w:r>
+          </w:p>
+        </w:tc>
+      </w:tr>
+    </w:tbl>
     <w:p>
-      <w:r>
-        <w:t>Clay, HubSpot, Smartlead, Instantly, Apollo, HeyReach, Claude Code, OpenAI, n8n, Python, Playwright, Trigify, PhantomBuster, Prospeo, Supabase, PostgreSQL, SEMrush, Ahrefs, GA4, Slack</w:t>
-      </w:r>
-    </w:p>
-    <w:p/>
-    <w:p>
+      <w:pPr>
+        <w:spacing w:before="180" w:after="40"/>
+        <w:pBdr>
+          <w:top w:val="single" w:sz="4" w:space="1" w:color="1B3A5C"/>
+        </w:pBdr>
+      </w:pPr>
       <w:r>
         <w:rPr>
+          <w:rFonts w:ascii="Calibri" w:hAnsi="Calibri"/>
           <w:b/>
-          <w:sz w:val="24"/>
+          <w:color w:val="1B3A5C"/>
+          <w:sz w:val="17"/>
         </w:rPr>
         <w:t>EDUCATION</w:t>
       </w:r>
     </w:p>
     <w:p>
+      <w:pPr>
+        <w:spacing w:before="40" w:after="20"/>
+      </w:pPr>
       <w:r>
-        <w:t>BCA Computer Science, Sabarmati University, 2020 | CSP Relevel 2021 | GTM Strategy Udemy 2022</w:t>
+        <w:rPr>
+          <w:rFonts w:ascii="Calibri" w:hAnsi="Calibri"/>
+          <w:b/>
+          <w:color w:val="101020"/>
+          <w:sz w:val="18"/>
+        </w:rPr>
+        <w:t xml:space="preserve">BCA, Computer Science - </w:t>
+      </w:r>
+      <w:r>
+        <w:rPr>
+          <w:rFonts w:ascii="Calibri" w:hAnsi="Calibri"/>
+          <w:color w:val="101020"/>
+          <w:sz w:val="18"/>
+        </w:rPr>
+        <w:t xml:space="preserve"> Sabarmati University, Ahmedabad  |  2020</w:t>
+      </w:r>
+    </w:p>
+    <w:p>
+      <w:pPr>
+        <w:spacing w:before="180" w:after="40"/>
+        <w:pBdr>
+          <w:top w:val="single" w:sz="4" w:space="1" w:color="1B3A5C"/>
+        </w:pBdr>
+      </w:pPr>
+      <w:r>
+        <w:rPr>
+          <w:rFonts w:ascii="Calibri" w:hAnsi="Calibri"/>
+          <w:b/>
+          <w:color w:val="1B3A5C"/>
+          <w:sz w:val="17"/>
+        </w:rPr>
+        <w:t>CERTIFICATIONS</w:t>
+      </w:r>
+    </w:p>
+    <w:p>
+      <w:pPr>
+        <w:spacing w:before="40" w:after="20"/>
+      </w:pPr>
+      <w:r>
+        <w:rPr>
+          <w:rFonts w:ascii="Calibri" w:hAnsi="Calibri"/>
+          <w:b/>
+          <w:color w:val="101020"/>
+          <w:sz w:val="18"/>
+        </w:rPr>
+        <w:t xml:space="preserve">Certified Sales Professional (CSP) - </w:t>
+      </w:r>
+      <w:r>
+        <w:rPr>
+          <w:rFonts w:ascii="Calibri" w:hAnsi="Calibri"/>
+          <w:color w:val="101020"/>
+          <w:sz w:val="18"/>
+        </w:rPr>
+        <w:t xml:space="preserve"> Relevel, 2021</w:t>
+      </w:r>
+    </w:p>
+    <w:p>
+      <w:pPr>
+        <w:spacing w:before="40" w:after="20"/>
+      </w:pPr>
+      <w:r>
+        <w:rPr>
+          <w:rFonts w:ascii="Calibri" w:hAnsi="Calibri"/>
+          <w:b/>
+          <w:color w:val="101020"/>
+          <w:sz w:val="18"/>
+        </w:rPr>
+        <w:t xml:space="preserve">Product Marketing &amp; GTM Strategy - </w:t>
+      </w:r>
+      <w:r>
+        <w:rPr>
+          <w:rFonts w:ascii="Calibri" w:hAnsi="Calibri"/>
+          <w:color w:val="101020"/>
+          <w:sz w:val="18"/>
+        </w:rPr>
+        <w:t xml:space="preserve"> Dekker Fraser, Udemy, 2022</w:t>
+      </w:r>
+    </w:p>
+    <w:p>
+      <w:pPr>
+        <w:spacing w:before="40" w:after="20"/>
+      </w:pPr>
+      <w:r>
+        <w:rPr>
+          <w:rFonts w:ascii="Calibri" w:hAnsi="Calibri"/>
+          <w:b/>
+          <w:color w:val="101020"/>
+          <w:sz w:val="18"/>
+        </w:rPr>
+        <w:t xml:space="preserve">Active Community: CC Strategic AI · AI Agency OS by ColdIQ · The GTM School · AI Automation (A-Z) - </w:t>
+      </w:r>
+      <w:r>
+        <w:rPr>
+          <w:rFonts w:ascii="Calibri" w:hAnsi="Calibri"/>
+          <w:color w:val="101020"/>
+          <w:sz w:val="18"/>
+        </w:rPr>
+        <w:t>152k members</w:t>
       </w:r>
     </w:p>
     <w:sectPr>
       <w:pgSz w:w="12240" w:h="15840"/>
-      <w:pgMar w:top="1440" w:right="1800" w:bottom="1440" w:left="1800" w:header="720" w:footer="720" w:gutter="0"/>
+      <w:pgMar w:top="792" w:right="1037" w:bottom="792" w:left="1037" w:header="720" w:footer="720" w:gutter="0"/>
       <w:cols w:space="720"/>
       <w:docGrid w:linePitch="360"/>
     </w:sectPr>
@@ -593,10 +1584,6 @@
     <w:name w:val="Normal"/>
     <w:qFormat/>
     <w:rsid w:val="00FC693F"/>
-    <w:rPr>
-      <w:rFonts w:ascii="Calibri" w:hAnsi="Calibri"/>
-      <w:sz w:val="22"/>
-    </w:rPr>
   </w:style>
   <w:style w:type="paragraph" w:styleId="Header">
     <w:name w:val="header"/>

</xml_diff>